<commit_message>
[ CV ] - update time line CV
update time line CV
</commit_message>
<xml_diff>
--- a/CV- TranVuHaiVinh.docx
+++ b/CV- TranVuHaiVinh.docx
@@ -1131,6 +1131,225 @@
           <w:rFonts w:ascii="Book Antiqua" w:hAnsi="Book Antiqua"/>
           <w:sz w:val="22"/>
           <w:szCs w:val="22"/>
+        </w:rPr>
+      </w:r>
+    </w:p>
+    <w:p>
+      <w:pPr>
+        <w:pStyle w:val="Normal"/>
+        <w:spacing w:lineRule="auto" w:line="276" w:before="120" w:after="0"/>
+        <w:rPr>
+          <w:rFonts w:ascii="Book Antiqua" w:hAnsi="Book Antiqua"/>
+          <w:b/>
+          <w:bCs/>
+          <w:sz w:val="22"/>
+          <w:szCs w:val="22"/>
+          <w:lang w:val="vi-VN"/>
+        </w:rPr>
+      </w:pPr>
+      <w:r>
+        <w:rPr>
+          <w:rFonts w:ascii="Book Antiqua" w:hAnsi="Book Antiqua"/>
+          <w:b/>
+          <w:bCs/>
+          <w:sz w:val="22"/>
+          <w:szCs w:val="22"/>
+          <w:lang w:val="vi-VN"/>
+        </w:rPr>
+        <w:t xml:space="preserve">02/202 – now: </w:t>
+      </w:r>
+      <w:r>
+        <w:rPr/>
+        <w:t>Verlora</w:t>
+      </w:r>
+    </w:p>
+    <w:p>
+      <w:pPr>
+        <w:pStyle w:val="Normal"/>
+        <w:spacing w:lineRule="auto" w:line="276" w:before="120" w:after="0"/>
+        <w:rPr>
+          <w:rFonts w:ascii="Book Antiqua" w:hAnsi="Book Antiqua"/>
+          <w:i/>
+          <w:iCs/>
+          <w:sz w:val="22"/>
+          <w:szCs w:val="22"/>
+          <w:lang w:val="vi-VN"/>
+        </w:rPr>
+      </w:pPr>
+      <w:r>
+        <w:rPr>
+          <w:rFonts w:ascii="Book Antiqua" w:hAnsi="Book Antiqua"/>
+          <w:i/>
+          <w:iCs/>
+          <w:sz w:val="22"/>
+          <w:szCs w:val="22"/>
+          <w:lang w:val="vi-VN"/>
+        </w:rPr>
+        <w:t xml:space="preserve">Founder &amp; Full-stack Developer </w:t>
+      </w:r>
+    </w:p>
+    <w:p>
+      <w:pPr>
+        <w:pStyle w:val="Normal"/>
+        <w:spacing w:lineRule="auto" w:line="276" w:before="120" w:after="0"/>
+        <w:rPr>
+          <w:rFonts w:ascii="Book Antiqua" w:hAnsi="Book Antiqua"/>
+          <w:sz w:val="22"/>
+          <w:szCs w:val="22"/>
+          <w:lang w:val="vi-VN"/>
+        </w:rPr>
+      </w:pPr>
+      <w:r>
+        <w:rPr>
+          <w:rFonts w:ascii="Book Antiqua" w:hAnsi="Book Antiqua"/>
+          <w:sz w:val="22"/>
+          <w:szCs w:val="22"/>
+          <w:lang w:val="vi-VN"/>
+        </w:rPr>
+        <w:t>Spa &amp; wellness booking platform with integrated e-commerce – letting salons take appointments and sell products in one place. Built for the Japanese market, designed as a multi-tenant SaaS.</w:t>
+      </w:r>
+    </w:p>
+    <w:p>
+      <w:pPr>
+        <w:pStyle w:val="Normal"/>
+        <w:spacing w:lineRule="auto" w:line="276" w:before="120" w:after="0"/>
+        <w:rPr>
+          <w:rFonts w:ascii="Book Antiqua" w:hAnsi="Book Antiqua"/>
+          <w:sz w:val="22"/>
+          <w:szCs w:val="22"/>
+          <w:lang w:val="vi-VN"/>
+        </w:rPr>
+      </w:pPr>
+      <w:r>
+        <w:rPr>
+          <w:rFonts w:ascii="Book Antiqua" w:hAnsi="Book Antiqua"/>
+          <w:sz w:val="22"/>
+          <w:szCs w:val="22"/>
+          <w:lang w:val="vi-VN"/>
+        </w:rPr>
+        <w:t>Stack: Nestjs - Vite - React - React Native - PostgreSQL - Redis - AWS</w:t>
+      </w:r>
+    </w:p>
+    <w:p>
+      <w:pPr>
+        <w:pStyle w:val="Normal"/>
+        <w:spacing w:lineRule="auto" w:line="276" w:before="120" w:after="0"/>
+        <w:rPr>
+          <w:rFonts w:ascii="Book Antiqua" w:hAnsi="Book Antiqua"/>
+          <w:sz w:val="22"/>
+          <w:szCs w:val="22"/>
+          <w:lang w:val="vi-VN"/>
+        </w:rPr>
+      </w:pPr>
+      <w:r>
+        <w:rPr>
+          <w:rFonts w:ascii="Book Antiqua" w:hAnsi="Book Antiqua"/>
+          <w:sz w:val="22"/>
+          <w:szCs w:val="22"/>
+          <w:lang w:val="vi-VN"/>
+        </w:rPr>
+        <w:t xml:space="preserve">- Designed and built the product end-to-end as a solo developer </w:t>
+      </w:r>
+    </w:p>
+    <w:p>
+      <w:pPr>
+        <w:pStyle w:val="Normal"/>
+        <w:spacing w:lineRule="auto" w:line="276" w:before="120" w:after="0"/>
+        <w:rPr>
+          <w:rFonts w:ascii="Book Antiqua" w:hAnsi="Book Antiqua"/>
+          <w:sz w:val="22"/>
+          <w:szCs w:val="22"/>
+        </w:rPr>
+      </w:pPr>
+      <w:r>
+        <w:rPr>
+          <w:rFonts w:ascii="Book Antiqua" w:hAnsi="Book Antiqua"/>
+          <w:sz w:val="22"/>
+          <w:szCs w:val="22"/>
+          <w:lang w:val="vi-VN"/>
+        </w:rPr>
+        <w:t>- Online booking: services, staff schedules, time slots</w:t>
+      </w:r>
+    </w:p>
+    <w:p>
+      <w:pPr>
+        <w:pStyle w:val="Normal"/>
+        <w:spacing w:lineRule="auto" w:line="276" w:before="120" w:after="0"/>
+        <w:rPr>
+          <w:rFonts w:ascii="Book Antiqua" w:hAnsi="Book Antiqua"/>
+          <w:sz w:val="22"/>
+          <w:szCs w:val="22"/>
+        </w:rPr>
+      </w:pPr>
+      <w:r>
+        <w:rPr>
+          <w:rFonts w:ascii="Book Antiqua" w:hAnsi="Book Antiqua"/>
+          <w:sz w:val="22"/>
+          <w:szCs w:val="22"/>
+          <w:lang w:val="vi-VN"/>
+        </w:rPr>
+        <w:t xml:space="preserve">- Integrated e-commerce: product catalog, cart, checkout alongside appointments </w:t>
+      </w:r>
+    </w:p>
+    <w:p>
+      <w:pPr>
+        <w:pStyle w:val="Normal"/>
+        <w:spacing w:lineRule="auto" w:line="276" w:before="120" w:after="0"/>
+        <w:rPr>
+          <w:rFonts w:ascii="Book Antiqua" w:hAnsi="Book Antiqua"/>
+          <w:sz w:val="22"/>
+          <w:szCs w:val="22"/>
+        </w:rPr>
+      </w:pPr>
+      <w:r>
+        <w:rPr>
+          <w:rFonts w:ascii="Book Antiqua" w:hAnsi="Book Antiqua"/>
+          <w:sz w:val="22"/>
+          <w:szCs w:val="22"/>
+        </w:rPr>
+        <w:t>- Multi-tenant architecture</w:t>
+      </w:r>
+    </w:p>
+    <w:p>
+      <w:pPr>
+        <w:pStyle w:val="Normal"/>
+        <w:spacing w:lineRule="auto" w:line="276" w:before="120" w:after="0"/>
+        <w:rPr>
+          <w:rFonts w:ascii="Book Antiqua" w:hAnsi="Book Antiqua"/>
+          <w:sz w:val="22"/>
+          <w:szCs w:val="22"/>
+        </w:rPr>
+      </w:pPr>
+      <w:r>
+        <w:rPr>
+          <w:rFonts w:ascii="Book Antiqua" w:hAnsi="Book Antiqua"/>
+          <w:sz w:val="22"/>
+          <w:szCs w:val="22"/>
+        </w:rPr>
+        <w:t>- Stripe</w:t>
+      </w:r>
+    </w:p>
+    <w:p>
+      <w:pPr>
+        <w:pStyle w:val="Normal"/>
+        <w:spacing w:lineRule="auto" w:line="276" w:before="120" w:after="0"/>
+        <w:rPr>
+          <w:rFonts w:ascii="Book Antiqua" w:hAnsi="Book Antiqua"/>
+          <w:b/>
+          <w:bCs/>
+          <w:sz w:val="22"/>
+          <w:szCs w:val="22"/>
+          <w:lang w:val="vi-VN"/>
+        </w:rPr>
+      </w:pPr>
+      <w:r>
+        <w:rPr>
+          <w:rFonts w:ascii="Book Antiqua" w:hAnsi="Book Antiqua"/>
+          <w:b/>
+          <w:bCs/>
+          <w:sz w:val="22"/>
+          <w:szCs w:val="22"/>
+          <w:lang w:val="vi-VN"/>
         </w:rPr>
       </w:r>
     </w:p>
@@ -11340,12 +11559,13 @@
     <w:rsid w:val="00144639"/>
     <w:pPr>
       <w:widowControl/>
+      <w:suppressAutoHyphens w:val="true"/>
       <w:bidi w:val="0"/>
       <w:spacing w:before="0" w:after="0"/>
       <w:jc w:val="start"/>
     </w:pPr>
     <w:rPr>
-      <w:rFonts w:eastAsia="Times New Roman" w:ascii="Times New Roman" w:hAnsi="Times New Roman" w:cs="Times New Roman"/>
+      <w:rFonts w:ascii="Times New Roman" w:hAnsi="Times New Roman" w:eastAsia="Times New Roman" w:cs="Times New Roman"/>
       <w:color w:val="auto"/>
       <w:kern w:val="0"/>
       <w:sz w:val="24"/>
@@ -11554,6 +11774,19 @@
     </w:pPr>
     <w:rPr/>
   </w:style>
+  <w:style w:type="paragraph" w:styleId="PreformattedText">
+    <w:name w:val="Preformatted Text"/>
+    <w:basedOn w:val="Normal"/>
+    <w:qFormat/>
+    <w:pPr>
+      <w:spacing w:before="0" w:after="0"/>
+    </w:pPr>
+    <w:rPr>
+      <w:rFonts w:ascii="Liberation Mono" w:hAnsi="Liberation Mono" w:eastAsia="Liberation Mono" w:cs="Liberation Mono"/>
+      <w:sz w:val="20"/>
+      <w:szCs w:val="20"/>
+    </w:rPr>
+  </w:style>
   <w:style w:type="numbering" w:styleId="NoList" w:default="1">
     <w:name w:val="No List"/>
     <w:uiPriority w:val="99"/>

</xml_diff>